<commit_message>
Add PPT, Chronovisor notes
</commit_message>
<xml_diff>
--- a/research-paper-notes/clock-synchronization/related papers.docx
+++ b/research-paper-notes/clock-synchronization/related papers.docx
@@ -53,7 +53,27 @@
             <w:sz w:val="32"/>
             <w:szCs w:val="32"/>
           </w:rPr>
-          <w:t xml:space="preserve">Multi-hop Precision Time Protocol: </w:t>
+          <w:t>Multi-hop Precision Ti</w:t>
+        </w:r>
+        <w:r>
+          <w:rPr>
+            <w:rStyle w:val="Hyperlink"/>
+            <w:b/>
+            <w:bCs/>
+            <w:sz w:val="32"/>
+            <w:szCs w:val="32"/>
+          </w:rPr>
+          <w:t>m</w:t>
+        </w:r>
+        <w:r>
+          <w:rPr>
+            <w:rStyle w:val="Hyperlink"/>
+            <w:b/>
+            <w:bCs/>
+            <w:sz w:val="32"/>
+            <w:szCs w:val="32"/>
+          </w:rPr>
+          <w:t xml:space="preserve">e Protocol: </w:t>
         </w:r>
         <w:proofErr w:type="gramStart"/>
         <w:r>
@@ -387,7 +407,27 @@
             <w:sz w:val="32"/>
             <w:szCs w:val="32"/>
           </w:rPr>
-          <w:t xml:space="preserve">Sundial: Fault-tolerant Clock Synchronization for </w:t>
+          <w:t>Sundial: Fault-toleran</w:t>
+        </w:r>
+        <w:r>
+          <w:rPr>
+            <w:rStyle w:val="Hyperlink"/>
+            <w:b/>
+            <w:bCs/>
+            <w:sz w:val="32"/>
+            <w:szCs w:val="32"/>
+          </w:rPr>
+          <w:t>t</w:t>
+        </w:r>
+        <w:r>
+          <w:rPr>
+            <w:rStyle w:val="Hyperlink"/>
+            <w:b/>
+            <w:bCs/>
+            <w:sz w:val="32"/>
+            <w:szCs w:val="32"/>
+          </w:rPr>
+          <w:t xml:space="preserve"> Clock Synchronization for </w:t>
         </w:r>
         <w:proofErr w:type="spellStart"/>
         <w:r>
@@ -612,7 +652,27 @@
             <w:sz w:val="32"/>
             <w:szCs w:val="32"/>
           </w:rPr>
-          <w:t>Graham: Synchronizing Clocks by Leveraging Local Clock Properties</w:t>
+          <w:t>Graham: Synchronizing Clocks by Leveraging Local Clock Prop</w:t>
+        </w:r>
+        <w:r>
+          <w:rPr>
+            <w:rStyle w:val="Hyperlink"/>
+            <w:b/>
+            <w:bCs/>
+            <w:sz w:val="32"/>
+            <w:szCs w:val="32"/>
+          </w:rPr>
+          <w:t>e</w:t>
+        </w:r>
+        <w:r>
+          <w:rPr>
+            <w:rStyle w:val="Hyperlink"/>
+            <w:b/>
+            <w:bCs/>
+            <w:sz w:val="32"/>
+            <w:szCs w:val="32"/>
+          </w:rPr>
+          <w:t>rties</w:t>
         </w:r>
       </w:hyperlink>
     </w:p>
@@ -729,7 +789,7 @@
             <w:b/>
             <w:bCs/>
           </w:rPr>
-          <w:t>Communication-efficient Clock Synch</w:t>
+          <w:t>Communication-efficient Clock Syn</w:t>
         </w:r>
         <w:r>
           <w:rPr>
@@ -737,7 +797,7 @@
             <w:b/>
             <w:bCs/>
           </w:rPr>
-          <w:t>r</w:t>
+          <w:t>c</w:t>
         </w:r>
         <w:r>
           <w:rPr>
@@ -745,6 +805,22 @@
             <w:b/>
             <w:bCs/>
           </w:rPr>
+          <w:t>h</w:t>
+        </w:r>
+        <w:r>
+          <w:rPr>
+            <w:rStyle w:val="Hyperlink"/>
+            <w:b/>
+            <w:bCs/>
+          </w:rPr>
+          <w:t>r</w:t>
+        </w:r>
+        <w:r>
+          <w:rPr>
+            <w:rStyle w:val="Hyperlink"/>
+            <w:b/>
+            <w:bCs/>
+          </w:rPr>
           <w:t>onization</w:t>
         </w:r>
       </w:hyperlink>
@@ -791,7 +867,7 @@
           <w:lang w:val="en-US"/>
         </w:rPr>
         <w:drawing>
-          <wp:inline distT="0" distB="0" distL="0" distR="0" wp14:anchorId="56E2EB76" wp14:editId="5A700141">
+          <wp:inline distT="0" distB="0" distL="0" distR="0" wp14:anchorId="56E2EB76" wp14:editId="46D3EFEC">
             <wp:extent cx="4597400" cy="2070100"/>
             <wp:effectExtent l="0" t="0" r="0" b="0"/>
             <wp:docPr id="1565481764" name="Picture 1" descr="A close-up of a text&#10;&#10;Description automatically generated"/>
@@ -814,7 +890,7 @@
                   <pic:spPr>
                     <a:xfrm>
                       <a:off x="0" y="0"/>
-                      <a:ext cx="4597400" cy="2070100"/>
+                      <a:ext cx="4622978" cy="2081617"/>
                     </a:xfrm>
                     <a:prstGeom prst="rect">
                       <a:avLst/>
@@ -844,7 +920,7 @@
         <w:rPr>
           <w:lang w:val="en-US"/>
         </w:rPr>
-        <w:t>Few other papers to review are:</w:t>
+        <w:t>Few other papers are:</w:t>
       </w:r>
     </w:p>
     <w:p>
@@ -853,20 +929,63 @@
           <w:rPr>
             <w:rStyle w:val="Hyperlink"/>
           </w:rPr>
-          <w:t xml:space="preserve">Anticipating synchronization with machine learning </w:t>
+          <w:t>Anticipating synchronization with machine le</w:t>
+        </w:r>
+        <w:r>
+          <w:rPr>
+            <w:rStyle w:val="Hyperlink"/>
+          </w:rPr>
+          <w:t>a</w:t>
+        </w:r>
+        <w:r>
+          <w:rPr>
+            <w:rStyle w:val="Hyperlink"/>
+          </w:rPr>
+          <w:t xml:space="preserve">rning </w:t>
         </w:r>
       </w:hyperlink>
       <w:r>
-        <w:t>- synchronization in networks.</w:t>
-      </w:r>
-    </w:p>
+        <w:t xml:space="preserve">– This is an unrelated paper as from what I understand, it is synchronization in </w:t>
+      </w:r>
+      <w:r>
+        <w:t>Complex Networks and Dynamic Systems</w:t>
+      </w:r>
+      <w:r>
+        <w:t xml:space="preserve"> </w:t>
+      </w:r>
+    </w:p>
+    <w:p/>
     <w:p>
       <w:hyperlink r:id="rId14" w:history="1">
         <w:r>
           <w:rPr>
             <w:rStyle w:val="Hyperlink"/>
           </w:rPr>
-          <w:t>Real Time Empirical Synchronization of IoT Signals for Improved AI Prognostics</w:t>
+          <w:t>Real T</w:t>
+        </w:r>
+        <w:r>
+          <w:rPr>
+            <w:rStyle w:val="Hyperlink"/>
+          </w:rPr>
+          <w:t>i</w:t>
+        </w:r>
+        <w:r>
+          <w:rPr>
+            <w:rStyle w:val="Hyperlink"/>
+          </w:rPr>
+          <w:t>me Emp</w:t>
+        </w:r>
+        <w:r>
+          <w:rPr>
+            <w:rStyle w:val="Hyperlink"/>
+          </w:rPr>
+          <w:t>i</w:t>
+        </w:r>
+        <w:r>
+          <w:rPr>
+            <w:rStyle w:val="Hyperlink"/>
+          </w:rPr>
+          <w:t>rical Synchronization of IoT Signals for Improved AI Prognostics</w:t>
         </w:r>
       </w:hyperlink>
       <w:r>
@@ -879,17 +998,27 @@
           <w:rPr>
             <w:rStyle w:val="Hyperlink"/>
           </w:rPr>
-          <w:t>Clock synchronization in industrial Internet of Things and potential works in precision time protocol: Review, challenges and future directions</w:t>
+          <w:t>Clock sy</w:t>
+        </w:r>
+        <w:r>
+          <w:rPr>
+            <w:rStyle w:val="Hyperlink"/>
+          </w:rPr>
+          <w:t>n</w:t>
+        </w:r>
+        <w:r>
+          <w:rPr>
+            <w:rStyle w:val="Hyperlink"/>
+          </w:rPr>
+          <w:t>chronization in industrial Internet of Things and potential works in precision time protocol: Review, challenges and future directions</w:t>
         </w:r>
       </w:hyperlink>
-    </w:p>
-    <w:p/>
-    <w:p>
-      <w:pPr>
+      <w:r>
         <w:rPr>
           <w:lang w:val="en-US"/>
         </w:rPr>
-      </w:pPr>
+        <w:t xml:space="preserve"> – A comparison between the existing clock synchronization algorithms. </w:t>
+      </w:r>
     </w:p>
     <w:sectPr>
       <w:pgSz w:w="11906" w:h="16838"/>

</xml_diff>